<commit_message>
Generate in-depth weekly IP watch
</commit_message>
<xml_diff>
--- a/public/reports/veille-2026-09-01.docx
+++ b/public/reports/veille-2026-09-01.docx
@@ -29,7 +29,7 @@
           <w:sz w:val="22"/>
           <w:szCs w:val="22"/>
         </w:rPr>
-        <w:t xml:space="preserve">Semaine du 26 août au 1er septembre 2026</w:t>
+        <w:t xml:space="preserve">25 août – 1er septembre 2026</w:t>
       </w:r>
     </w:p>
     <w:p>
@@ -60,20 +60,20 @@
           <w:bCs/>
           <w:u w:val="single"/>
         </w:rPr>
-        <w:t xml:space="preserve">Marques – Le Tribunal statue dans l’affaire Barcelona Mediterranean Wine (BARCELONA MEDITERRANEAN WINE)</w:t>
+        <w:t xml:space="preserve">Brevets – opposition et activité inventive – T 0918/24 – Annuloplasty system for monitoring the effectiveness of an annuloplasty treatment</w:t>
       </w:r>
     </w:p>
     <w:p>
       <w:pPr>
         <w:spacing w:after="240"/>
       </w:pPr>
-      <w:hyperlink w:history="1" r:id="rIdnduyrxwc_vwqwh7wxjdlv">
+      <w:hyperlink w:history="1" r:id="rId0q8bggdfug5uc8kp6-mq9">
         <w:r>
           <w:rPr>
             <w:color w:val="507D82"/>
             <w:u w:val="single"/>
           </w:rPr>
-          <w:t xml:space="preserve">Tribunal de l’Union européenne, ordonnance du 17 août 2026, T-123/26, INAO et Inter-Med / EUIPO – Barcelona Mediterranean Wine (BARCELONA MEDITERRANEAN WINE), ECLI:EU:T:2026:498, 2026-08-17</w:t>
+          <w:t xml:space="preserve">OEB, chambre technique de recours 3.2.02, 25 août 2026, T 0918/24, ECLI:EP:BA:2026:T091824.20260825, 31/08/2026</w:t>
         </w:r>
       </w:hyperlink>
     </w:p>
@@ -83,52 +83,52 @@
         <w:jc w:val="both"/>
       </w:pPr>
       <w:r>
-        <w:t xml:space="preserve">La source institutionnelle consultée identifie une ordonnance du Tribunal de l’Union européenne rendue le 17 août 2026 dans l’affaire T-123/26, intitulée INAO et Inter-Med / EUIPO – Barcelona Mediterranean Wine (BARCELONA MEDITERRANEAN WINE), sous l’ECLI EU:T:2026:498. Elle confirme ainsi l’existence, la date, la juridiction, les parties désignées et la nature de la décision. En revanche, l’URL communiquée renvoie vers une interface InfoCuria ne donnant pas accès, dans les conditions de consultation disponibles, au texte de l’ordonnance ni à une fiche documentaire contenant ses motifs, son dispositif ou les données procédurales utiles. Il n’est dès lors pas possible de rédiger une analyse jurisprudentielle de fond, de 650 à 900 mots, exclusivement à partir d’informations vérifiables, sans suppléer par des hypothèses au contenu du document primaire. ([curia.europa.eu](https://curia.europa.eu/site/plugins/CURIA2MainPlugin/types/MultilingualShortcut/processExternalMultilingualShortcut.jsp?pubId=1037304_MultilingualShortcut&amp;utm_source=openai))</w:t>
-      </w:r>
-    </w:p>
-    <w:p>
-      <w:pPr>
-        <w:spacing w:after="180" w:line="300"/>
-        <w:jc w:val="both"/>
-      </w:pPr>
-      <w:r>
-        <w:t xml:space="preserve">Les faits à l’origine du recours ne sont pas précisés dans le résultat institutionnel accessible. L’intitulé de l’affaire permet seulement d’établir que l’INAO et Inter-Med sont désignés conjointement comme requérants face à l’EUIPO, Barcelona Mediterranean Wine étant mentionnée dans le titre de l’affaire. Il ne permet pas d’identifier avec certitude la procédure administrative antérieure, la marque de l’Union concernée, les produits et services visés, la décision de l’EUIPO attaquée, la chambre de recours éventuellement saisie, ni la date d’introduction du recours. La qualification de l’affaire dans la catégorie des marques ne saurait, à elle seule, permettre de reconstituer ces éléments.</w:t>
-      </w:r>
-    </w:p>
-    <w:p>
-      <w:pPr>
-        <w:spacing w:after="180" w:line="300"/>
-        <w:jc w:val="both"/>
-      </w:pPr>
-      <w:r>
-        <w:t xml:space="preserve">Les moyens invoqués par l’INAO et Inter-Med, les demandes présentées devant le Tribunal, les observations de l’EUIPO et la position de Barcelona Mediterranean Wine ne sont pas accessibles dans la source institutionnelle consultée. Il n’est notamment pas possible de déterminer si le litige portait sur un motif absolu ou relatif de refus ou de nullité, sur l’usage d’une indication géographique, sur le caractère descriptif ou trompeur d’un signe, sur un risque de confusion, ou sur toute autre question relevant du droit des marques de l’Union. Aucun argument ne peut donc être attribué aux parties.</w:t>
-      </w:r>
-    </w:p>
-    <w:p>
-      <w:pPr>
-        <w:spacing w:after="180" w:line="300"/>
-        <w:jc w:val="both"/>
-      </w:pPr>
-      <w:r>
-        <w:t xml:space="preserve">La question de droit n’est pas précisée dans le document institutionnel accessible. Une formulation explicite de cette question supposerait de connaître au minimum la décision de l’EUIPO contestée, les moyens du recours et les motifs retenus par le Tribunal. Ces informations ne figurent pas dans le résultat de recherche disponible ; toute formulation substantielle serait spéculative.</w:t>
-      </w:r>
-    </w:p>
-    <w:p>
-      <w:pPr>
-        <w:spacing w:after="180" w:line="300"/>
-        <w:jc w:val="both"/>
-      </w:pPr>
-      <w:r>
-        <w:t xml:space="preserve">Le résultat InfoCuria confirme que le Tribunal a rendu une ordonnance, et non un arrêt, le 17 août 2026. Toutefois, il ne reproduit aucun considérant et ne donne aucune indication sur le fondement procédural ou matériel de cette ordonnance. En particulier, il n’est pas possible d’établir si le Tribunal a statué sur la recevabilité du recours, sur un désistement, sur un non-lieu à statuer, sur les dépens, ou sur le bien-fondé des griefs soulevés contre une décision de l’EUIPO. Il ne peut pas davantage être déterminé si le Tribunal a appliqué le règlement (UE) 2017/1001, un régime européen de protection des indications géographiques, ou une autre norme pertinente. L’analyse du raisonnement juridictionnel est donc impossible sur une base documentaire vérifiable.</w:t>
-      </w:r>
-    </w:p>
-    <w:p>
-      <w:pPr>
-        <w:spacing w:after="180" w:line="300"/>
-        <w:jc w:val="both"/>
-      </w:pPr>
-      <w:r>
-        <w:t xml:space="preserve">La seule solution vérifiable est l’existence d’une ordonnance rendue par le Tribunal le 17 août 2026 dans l’affaire T-123/26, ECLI:EU:T:2026:498. Le sens exact de cette ordonnance, son éventuel dispositif, le sort réservé au recours et la répartition des dépens ne sont pas précisés dans la source consultée. ([curia.europa.eu](https://curia.europa.eu/site/plugins/CURIA2MainPlugin/types/MultilingualShortcut/processExternalMultilingualShortcut.jsp?pubId=1037304_MultilingualShortcut&amp;utm_source=openai))</w:t>
+        <w:t xml:space="preserve">Par décision du 25 août 2026, mise en ligne le 31 août 2026, la chambre technique de recours 3.2.02 de l’Office européen des brevets a infirmé la décision de révocation du brevet européen n° 3 288 494, détenu par Kephalios S.A.S. Le litige portait sur l’activité inventive, au regard de l’article 56 CBE, d’un système d’annuloplastie destiné à apprécier l’efficacité d’un traitement d’insuffisance valvulaire. La décision illustre l’exigence d’un lien concret entre l’enseignement du document secondaire et le problème technique objectivement posé : la seule proximité générale avec la surveillance de paramètres cardiaques ne suffisait pas à justifier la combinaison proposée en opposition.</w:t>
+      </w:r>
+    </w:p>
+    <w:p>
+      <w:pPr>
+        <w:spacing w:after="180" w:line="300"/>
+        <w:jc w:val="both"/>
+      </w:pPr>
+      <w:r>
+        <w:t xml:space="preserve">Le brevet concerne un système comprenant un anneau d’annuloplastie réglable implantable, une interface interne susceptible de coopérer avec un manipulateur, un dispositif de délivrance sous la forme d’un cathéter et un capteur apte à détecter une régurgitation de la valve native. Le capteur est relié à l’assemblage annulaire, susceptible de l’être ou intégré à celui-ci ; un moniteur externe ou dispositif de signalisation affiche une information fondée sur la régurgitation détectée. Selon la chambre, l’annuloplastie vise à remodeler ou renforcer l’anneau valvulaire afin de corriger une fonction valvulaire insuffisante. Dans une procédure classique, l’efficacité de la correction ne peut être appréciée qu’après redémarrage du cœur ; les dispositifs réglables récents peuvent, eux, être remodelés in situ. Le brevet entend ainsi permettre l’évaluation de l’effet de la manipulation de l’anneau implanté. La division d’opposition avait révoqué le brevet par décision du 2 mai 2024 sur le fondement de l’article 101, paragraphe 3, sous b), CBE. La titulaire a formé recours et sollicité le maintien du brevet tel que délivré ou, subsidiairement, sur le fondement de sept jeux de revendications auxiliaires. Après une opinion préliminaire favorable au quatrième jeu auxiliaire, la titulaire l’a érigé en requête principale et a déposé une description adaptée. L’opposant n’a produit aucune réponse au recours ni aucune observation sur cette description, malgré l’invitation adressée par la chambre le 12 juin 2026.</w:t>
+      </w:r>
+    </w:p>
+    <w:p>
+      <w:pPr>
+        <w:spacing w:after="180" w:line="300"/>
+        <w:jc w:val="both"/>
+      </w:pPr>
+      <w:r>
+        <w:t xml:space="preserve">La division d’opposition avait considéré que la revendication 1 de la requête devenue principale était dépourvue d’activité inventive à partir de D1, combiné soit avec D15, soit avec D9. La titulaire soutenait que D1 ne divulguait ni un capteur configuré pour détecter une régurgitation de la valve native, ni un moniteur externe affichant une information issue de cette détection. Ces caractéristiques permettraient d’améliorer le traitement d’annuloplastie. Selon elle, D15 concernait la détection précoce de dysfonctionnements affectant des valves prothétiques et non l’amélioration d’un traitement par anneau d’annuloplastie. D9 ne mentionnerait la perception d’une valeur liée à la régurgitation qu’au titre d’un tube de pression intégré à un instrument de délivrance ; il ne décrirait ni capteur de régurgitation sur un anneau d’annuloplastie ni dispositif d’affichage. Aucun argument de fond n’a été présenté par l’opposant au stade du recours.</w:t>
+      </w:r>
+    </w:p>
+    <w:p>
+      <w:pPr>
+        <w:spacing w:after="180" w:line="300"/>
+        <w:jc w:val="both"/>
+      </w:pPr>
+      <w:r>
+        <w:t xml:space="preserve">La question de droit était de savoir si l’homme du métier, partant de D1, qui divulgue un dispositif implantable réglable muni d’un capteur pouvant mesurer une pression ou un débit à travers le dispositif, aurait été conduit, à la lumière de D15 ou de D9, à prévoir un capteur associé à l’anneau d’annuloplastie pour détecter la régurgitation de la valve native ainsi qu’un moniteur externe ou dispositif de signalisation affichant l’information correspondante, afin d’améliorer la surveillance de l’efficacité du traitement d’annuloplastie.</w:t>
+      </w:r>
+    </w:p>
+    <w:p>
+      <w:pPr>
+        <w:spacing w:after="180" w:line="300"/>
+        <w:jc w:val="both"/>
+      </w:pPr>
+      <w:r>
+        <w:t xml:space="preserve">La chambre retient d’abord, à l’instar de la division d’opposition, que D1 ne divulgue pas les deux caractéristiques distinctives précitées. Elle identifie leur effet technique dans la facilitation du suivi des conséquences de la manipulation de l’anneau d’annuloplastie. Le problème technique objectif est donc formulé comme l’amélioration de la surveillance de l’efficacité du traitement d’annuloplastie mis en œuvre dans D1. S’agissant de D15, la chambre relève que cette publication scientifique porte sur des capteurs intégrés à des valves cardiaques prothétiques, employés pour détecter précocement des anomalies telles qu’une formation de thrombus ou une rigidification des feuillets, avant leur manifestation clinique. D15 vise ainsi une surveillance à long terme du fonctionnement d’une valve prothétique, et non l’appréciation de l’efficacité d’un traitement d’annuloplastie. Ce document ne traitant pas du problème objectif retenu, l’homme du métier ne l’aurait pas consulté. Concernant D9, la chambre observe que son paragraphe 0134 prévoit l’utilisation de la lumière d’un cathéter ou d’un outil pour une surveillance de pression fournissant un retour indicatif d’une régurgitation. D9 ne suggère toutefois pas de détecter cette régurgitation au moyen d’un capteur de débit placé sur un anneau d’annuloplastie. Il ne divulgue pas davantage un affichage externe des informations concernées. Dès lors, D9 n’incitait pas l’homme du métier à transformer le capteur associé au dispositif implantable de D1 en capteur de régurgitation ni à ajouter le moniteur requis par la revendication. La chambre note enfin que les autres objections examinées en première instance contre cette requête n’avaient pas été jugées convaincantes et qu’aucune objection restante ne faisait obstacle au maintien du brevet. La description adaptée a été jugée conforme à la CBE.</w:t>
+      </w:r>
+    </w:p>
+    <w:p>
+      <w:pPr>
+        <w:spacing w:after="180" w:line="300"/>
+        <w:jc w:val="both"/>
+      </w:pPr>
+      <w:r>
+        <w:t xml:space="preserve">La chambre annule la décision de révocation. Elle renvoie l’affaire à la division d’opposition avec ordre de maintenir le brevet sous une forme modifiée : les revendications 1 à 9 de la nouvelle requête principale, initialement déposées comme quatrième requête auxiliaire le 29 août 2024, la description déposée le 2 juin 2026 et les figures 1 à 7 du fascicule du brevet. La chambre conclut expressément que les combinaisons D1-D15 et D1-D9 ne privent pas la revendication 1 d’activité inventive.</w:t>
       </w:r>
     </w:p>
     <w:p>
@@ -148,7 +148,110 @@
         <w:t xml:space="preserve">Portée pratique. </w:t>
       </w:r>
       <w:r>
-        <w:t xml:space="preserve">Aucune portée pratique précise ne peut être dégagée sans accès au texte intégral ou à une fiche décisionnelle détaillée. La référence appelle une vérification ultérieure sur un document primaire directement téléchargeable depuis Curia, afin d’identifier la décision de l’EUIPO en cause, la règle de droit appliquée, les motifs de l’ordonnance et son dispositif. Jusqu’à cette vérification, cette affaire ne doit pas être présentée comme une décision établissant ou confirmant une solution en droit des marques.</w:t>
+        <w:t xml:space="preserve">La décision confirme qu’en matière d’activité inventive, l’identification de caractéristiques manquantes dans l’art antérieur le plus proche doit être suivie d’une démonstration rigoureuse de la motivation à les emprunter au document secondaire. Un document relatif à une finalité clinique distincte, telle que la détection durable de défaillances d’une valve prothétique, ne répond pas nécessairement au problème d’évaluation immédiate de l’efficacité d’une annuloplastie réglable. De même, un enseignement relatif à un retour de pression fourni par un cathéter ne permet pas, sans indication complémentaire, de conclure à l’évidence d’un capteur intégré ou relié à l’anneau et d’un affichage externe fondé sur la régurgitation détectée. Pour la rédaction et la défense des brevets de dispositifs médicaux, l’arrêt souligne l’intérêt de caractériser précisément la localisation fonctionnelle du capteur, le paramètre mesuré et l’usage clinique spécifique de l’information recueillie.</w:t>
+      </w:r>
+    </w:p>
+    <w:p>
+      <w:pPr>
+        <w:pStyle w:val="Heading2"/>
+        <w:keepNext/>
+        <w:spacing w:after="100" w:before="180"/>
+      </w:pPr>
+      <w:r>
+        <w:rPr>
+          <w:b/>
+          <w:bCs/>
+          <w:u w:val="single"/>
+        </w:rPr>
+        <w:t xml:space="preserve">Marques – nom de domaine et risque de confusion – Antériorité d’une dénomination sociale et transfert d’un nom de domaine créant un risque de confusion</w:t>
+      </w:r>
+    </w:p>
+    <w:p>
+      <w:pPr>
+        <w:spacing w:after="240"/>
+      </w:pPr>
+      <w:hyperlink w:history="1" r:id="rIdjbikttcmi0sd8-myhvb9k">
+        <w:r>
+          <w:rPr>
+            <w:color w:val="507D82"/>
+            <w:u w:val="single"/>
+          </w:rPr>
+          <w:t xml:space="preserve">Tribunal judiciaire de Rennes, 2e chambre civile, 10 août 2026, RG n° 22/05973, Portalis DBYC-W-B7G-J4X2, 10/08/2026</w:t>
+        </w:r>
+      </w:hyperlink>
+    </w:p>
+    <w:p>
+      <w:pPr>
+        <w:spacing w:after="180" w:line="300"/>
+        <w:jc w:val="both"/>
+      </w:pPr>
+      <w:r>
+        <w:t xml:space="preserve">Par jugement du 10 août 2026, le tribunal judiciaire de Rennes statue sur un conflit opposant des entreprises du secteur du bâtiment autour du signe LEFEVRE, décliné comme marque, dénominations sociales, nom commercial et noms de domaine. La décision distingue les effets respectifs de l’antériorité invoquée à l’appui d’une action en nullité de marque et de la protection, sur le terrain de la concurrence déloyale, d’un nom de domaine exploité postérieurement. Elle rappelle surtout que l’existence de droits prétendument plus anciens au bénéfice du titulaire de la marque ne prive pas le titulaire d’une dénomination sociale antérieure de la faculté de défendre son propre droit antérieur. ([courdecassation.fr](https://www.courdecassation.fr/decision/6a7a1a56195da062e03bb62f?utm_source=openai))</w:t>
+      </w:r>
+    </w:p>
+    <w:p>
+      <w:pPr>
+        <w:spacing w:after="180" w:line="300"/>
+        <w:jc w:val="both"/>
+      </w:pPr>
+      <w:r>
+        <w:t xml:space="preserve">La société AURIGE, anciennement dénommée M LEFEVRE jusqu’en 2018, est la société mère d’un groupe intervenant dans le bâtiment. Elle est titulaire de la marque verbale française LEFEVRE n° 15/4225658, déposée le 13 novembre 2015 et enregistrée le 11 mars 2016 pour des produits et services des classes 3, 37, 40 et 42. Sa filiale, la société LEFEVRE, immatriculée en 1990, exerce notamment des activités de rénovation et dispose de deux noms de domaine réservés en 1998 et 2010. La société LEFEVRE R, immatriculée le 27 janvier 2015 pour une activité de maçonnerie générale et de gros œuvre, a fait réaliser un site dont le nom de domaine a été réservé le 24 juillet 2020 par la société CREATEUR D’IMAGE. Après une mise en demeure du 11 janvier 2021, les sociétés AURIGE et LEFEVRE ont assigné, les 2 et 3 août 2022, LEFEVRE R et CREATEUR D’IMAGE en contrefaçon de marque, concurrence déloyale et parasitisme. LEFEVRE R a reconventionnellement demandé l’annulation partielle de la marque pour certains services des classes 37 et 42. Le juge de la mise en état avait déclaré cette même demande irrecevable à l’égard de CREATEUR D’IMAGE, faute de qualité à agir, mais avait rejeté la fin de non-recevoir tirée de la forclusion par tolérance. ([courdecassation.fr](https://www.courdecassation.fr/decision/6a7a1a56195da062e03bb62f?utm_source=openai))</w:t>
+      </w:r>
+    </w:p>
+    <w:p>
+      <w:pPr>
+        <w:spacing w:after="180" w:line="300"/>
+        <w:jc w:val="both"/>
+      </w:pPr>
+      <w:r>
+        <w:t xml:space="preserve">Les demanderesses soutenaient que l’emploi du signe LEFEVRE par LEFEVRE R, y compris dans le nom de domaine et sous la présentation « LEFEVRE La signature rénovation », portait atteinte à la marque et créait une confusion avec leurs propres signes distinctifs, au regard de services identiques ou très similaires. Elles invoquaient également le caractère fautif de l’exploitation du nom de domaine et reprochaient à leur concurrente de se présenter comme les « Etablissements LEFEVRE ». Elles faisaient valoir que leurs droits sur la dénomination LEFEVRE et leurs noms de domaine étaient antérieurs à la dénomination de LEFEVRE R. Cette dernière opposait l’antériorité de sa dénomination sociale, utilisée depuis son immatriculation de janvier 2015, au dépôt de la marque de novembre 2015. Elle en déduisait un risque de confusion justifiant la nullité partielle de la marque, et, subsidiairement, se prévalait de l’usage antérieur de son nom commercial. ([courdecassation.fr](https://www.courdecassation.fr/decision/6a7a1a56195da062e03bb62f?utm_source=openai))</w:t>
+      </w:r>
+    </w:p>
+    <w:p>
+      <w:pPr>
+        <w:spacing w:after="180" w:line="300"/>
+        <w:jc w:val="both"/>
+      </w:pPr>
+      <w:r>
+        <w:t xml:space="preserve">Une société qui exploite une dénomination sociale antérieure au dépôt d’une marque peut-elle solliciter l’annulation de cette marque pour les services concernés, en dépit de droits distinctifs plus anciens allégués par le titulaire de la marque, et l’exploitation ultérieure d’un nom de domaine proche de noms de domaine préexistants peut-elle, indépendamment de l’action en contrefaçon, caractériser une concurrence déloyale par risque de confusion ?</w:t>
+      </w:r>
+    </w:p>
+    <w:p>
+      <w:pPr>
+        <w:spacing w:after="180" w:line="300"/>
+        <w:jc w:val="both"/>
+      </w:pPr>
+      <w:r>
+        <w:t xml:space="preserve">Le tribunal vise l’article L. 711-3, 3°, du code de la propriété intellectuelle, dans sa rédaction applicable depuis le 15 décembre 2019, aux termes duquel une marque peut être déclarée nulle lorsqu’elle porte atteinte à une dénomination ou raison sociale antérieure produisant effet en France, dès lors qu’il existe un risque de confusion. Il relève que LEFEVRE R a été immatriculée sous cette dénomination le 27 janvier 2015, soit antérieurement au dépôt et à l’enregistrement de la marque verbale LEFEVRE. Il écarte l’argument selon lequel les droits plus anciens des sociétés AURIGE et LEFEVRE feraient obstacle à l’invocation de cette antériorité : un titulaire peut défendre sa dénomination sociale, même si l’autre partie revendique des droits antérieurs plus anciens. Le tribunal se réfère à cet égard à l’arrêt de la chambre commerciale du 10 janvier 2024, pourvoi n° 22-21.716. L’analyse du risque de confusion porte sur la forte proximité des signes LEFEVRE et LEFEVRE R, ainsi que sur l’identité ou la similitude des services de construction, rénovation et prestations connexes visés ou exercés. S’agissant du nom de domaine, le tribunal retient une faute autonome de concurrence déloyale : l’exploitation du nom litigieux, postérieure aux deux noms de domaine détenus par la société LEFEVRE et employée pour des activités proches, est de nature à créer une confusion entre les entreprises. Il précise que le parasitisme allégué n’est pas établi. ([courdecassation.fr](https://www.courdecassation.fr/decision/6a7a1a56195da062e03bb62f?utm_source=openai))</w:t>
+      </w:r>
+    </w:p>
+    <w:p>
+      <w:pPr>
+        <w:spacing w:after="180" w:line="300"/>
+        <w:jc w:val="both"/>
+      </w:pPr>
+      <w:r>
+        <w:t xml:space="preserve">Le tribunal accueille la demande de nullité partielle de la marque LEFEVRE pour les services des classes 37 et 42 concernés par l’antériorité de la dénomination sociale LEFEVRE R. Les demandes en contrefaçon fondées sur cette marque ne peuvent donc prospérer pour le périmètre annulé. En revanche, il retient des actes de concurrence déloyale limités à l’exploitation du nom de domaine par LEFEVRE R. Il lui interdit de poursuivre cette exploitation et ordonne le transfert du nom de domaine au profit de la société LEFEVRE, à charge pour la partie la plus diligente de transmettre le jugement à l’AFNIC. Considérant que ces mesures réparent suffisamment le préjudice établi, il n’alloue pas de dommages-intérêts au titre de cette exploitation et n’assortit pas l’interdiction d’une astreinte à ce stade. ([courdecassation.fr](https://www.courdecassation.fr/decision/6a7a1a56195da062e03bb62f?utm_source=openai))</w:t>
+      </w:r>
+    </w:p>
+    <w:p>
+      <w:pPr>
+        <w:pBdr>
+          <w:left w:val="single" w:color="507D82" w:sz="10" w:space="8"/>
+        </w:pBdr>
+        <w:spacing w:after="260" w:before="80"/>
+        <w:ind w:left="180"/>
+        <w:jc w:val="both"/>
+      </w:pPr>
+      <w:r>
+        <w:rPr>
+          <w:b/>
+          <w:bCs/>
+        </w:rPr>
+        <w:t xml:space="preserve">Portée pratique. </w:t>
+      </w:r>
+      <w:r>
+        <w:t xml:space="preserve">La décision impose d’apprécier séparément la chaîne des antériorités selon le droit invoqué. Le titulaire d’une marque ne peut neutraliser, par la seule invocation de droits plus anciens dont il disposerait, la dénomination sociale antérieure opposée contre sa marque par un tiers. La sécurisation d’une stratégie de marque exige donc de vérifier les dénominations sociales effectivement exploitées avant le dépôt, y compris lorsque le déposant utilise historiquement le même patronyme ou terme. La décision confirme par ailleurs l’autonomie du contentieux du nom de domaine : une action en concurrence déloyale peut conduire à une interdiction et à un transfert lorsque l’usage numérique postérieur entretient un risque de confusion avec des noms de domaine préexistants. Elle invite, enfin, à individualiser les faits de contrefaçon, de concurrence déloyale et de parasitisme, ainsi que les préjudices attachés à chacun d’eux. ([courdecassation.fr](https://www.courdecassation.fr/decision/6a7a1a56195da062e03bb62f?utm_source=openai))</w:t>
       </w:r>
     </w:p>
     <w:p>
@@ -179,20 +282,20 @@
           <w:bCs/>
           <w:u w:val="single"/>
         </w:rPr>
-        <w:t xml:space="preserve">Journal officiel de l’EUIPO : nouvelles décisions relatives aux bulletins, registres, documents de priorité et lignes directrices d’examen</w:t>
+        <w:t xml:space="preserve">Séances plénières du CSPLA 2025</w:t>
       </w:r>
     </w:p>
     <w:p>
       <w:pPr>
         <w:spacing w:after="240"/>
       </w:pPr>
-      <w:hyperlink w:history="1" r:id="rIdt2un--fe9flgocnu_rqt2">
+      <w:hyperlink w:history="1" r:id="rId5xyedcgcsz6hpsedpyk2j">
         <w:r>
           <w:rPr>
             <w:color w:val="507D82"/>
             <w:u w:val="single"/>
           </w:rPr>
-          <w:t xml:space="preserve">Décisions EX 26 06, EX 26 07, EX 26 08 et EX 26 09 de l’EUIPO, 2026-08-03</w:t>
+          <w:t xml:space="preserve">CSPLA, compte rendu provisoire de la séance plénière du 15 décembre 2025, 07/08/2026</w:t>
         </w:r>
       </w:hyperlink>
     </w:p>
@@ -202,52 +305,52 @@
         <w:jc w:val="both"/>
       </w:pPr>
       <w:r>
-        <w:t xml:space="preserve">Dans le contexte de l’entrée en application du nouveau cadre réglementaire des dessins ou modèles de l’Union européenne, l’EUIPO a publié au Journal officiel du 3 août 2026 les décisions EX-26-06, EX-26-07 et EX-26-08, toutes datées du 8 juin 2026, ainsi que la décision EX-26-09 du 30 juin 2026. Ces textes, entrés en vigueur le 1er juillet 2026, remplacent ou actualisent plusieurs décisions antérieures afin d’aligner la pratique administrative, la terminologie et les références juridiques de l’Office sur le règlement (UE) 2026/715 relatif aux dessins ou modèles de l’Union européenne. ([euipo.europa.eu](https://www.euipo.europa.eu/fr/law/communications-and-decisions-ed/official-journal?utm_source=openai))</w:t>
-      </w:r>
-    </w:p>
-    <w:p>
-      <w:pPr>
-        <w:spacing w:after="180" w:line="300"/>
-        <w:jc w:val="both"/>
-      </w:pPr>
-      <w:r>
-        <w:t xml:space="preserve">La décision EX-26-06 encadre la publication du Bulletin des marques de l’Union européenne et du Bulletin des dessins ou modèles de l’Union européenne. Les deux bulletins sont disponibles sous forme électronique, gratuitement et en ligne ; ils sont publiés chaque jour d’ouverture de l’Office, sauf difficulté technique exceptionnelle. Les éditions à compter du premier bulletin de 2006 sont consultables sans demande préalable ; les éditions antérieures ne sont accessibles que sur demande. La décision abroge la décision EX-18-3. ([euipo.europa.eu](https://euipo.europa.eu/tunnel-web/secure/webdav/guest/document_library/contentPdfs/law_and_practice/decisions_president/EX-26-6_en.pdf))</w:t>
-      </w:r>
-    </w:p>
-    <w:p>
-      <w:pPr>
-        <w:spacing w:after="180" w:line="300"/>
-        <w:jc w:val="both"/>
-      </w:pPr>
-      <w:r>
-        <w:t xml:space="preserve">Sans objet : il ne s’agit pas d’une procédure contentieuse ni d’une décision rendue entre parties.</w:t>
-      </w:r>
-    </w:p>
-    <w:p>
-      <w:pPr>
-        <w:spacing w:after="180" w:line="300"/>
-        <w:jc w:val="both"/>
-      </w:pPr>
-      <w:r>
-        <w:t xml:space="preserve">Sans objet. Les décisions analysées déterminent des modalités d’organisation, d’accès à l’information et de pratique administrative de l’EUIPO.</w:t>
-      </w:r>
-    </w:p>
-    <w:p>
-      <w:pPr>
-        <w:spacing w:after="180" w:line="300"/>
-        <w:jc w:val="both"/>
-      </w:pPr>
-      <w:r>
-        <w:t xml:space="preserve">La décision EX-26-07 distingue le registre électronique, qui constitue le relevé officiel des inscriptions, de la base de données relative aux titres et procédures. Les inscriptions concernant une marque deviennent accessibles dès que la demande est réputée déposée ; celles concernant un dessin ou modèle le deviennent à compter de son enregistrement. Les dessins ou modèles faisant l’objet d’un ajournement de publication restent toutefois exclus de l’accès public jusqu’à leur publication. Les extraits certifiés des registres peuvent être téléchargés sans frais depuis l’espace utilisateur. La décision prévoit également des inscriptions protectrices liées notamment à des mesures restrictives ou au gel d’un droit, ainsi que les conditions de diffusion des données et de la base de jurisprudence. ([euipo.europa.eu](https://euipo.europa.eu/tunnel-web/secure/webdav/guest/document_library/contentPdfs/law_and_practice/decisions_president/EX-26-7_en.pdf)) La décision EX-26-08 simplifie la preuve de priorité pour les dessins ou modèles enregistrés de l’Union : lorsque la documentation est disponible via le service DAS de l’OMPI, le demandeur peut fournir le code d’accès DAS et les données d’identification de la demande antérieure ; l’Office récupère alors le document et l’intègre au dossier. ([euipo.europa.eu](https://euipo.europa.eu/tunnel-web/secure/webdav/guest/document_library/contentPdfs/law_and_practice/decisions_president/EX-26-8_en.pdf)) Enfin, la décision EX-26-09 adopte l’édition 2026 des directives d’examen, lesquelles constituent des règles de conduite administrative et non des actes législatifs. Elles sont applicables depuis le 1er juillet 2026. ([guidelines.euipo.europa.eu](https://guidelines.euipo.europa.eu/2318651/2445755/designs-guidelines/1-introduction?utm_source=openai))</w:t>
-      </w:r>
-    </w:p>
-    <w:p>
-      <w:pPr>
-        <w:spacing w:after="180" w:line="300"/>
-        <w:jc w:val="both"/>
-      </w:pPr>
-      <w:r>
-        <w:t xml:space="preserve">Les décisions EX-26-06, EX-26-07 et EX-26-08 abrogent respectivement les décisions EX-18-3, EX-25-5 et EX-20-7. L’édition 2026 des directives, adoptée par la décision EX-26-09, remplace la pratique antérieure dans les domaines concernés. La publication au Journal officiel du 3 août 2026 assure leur publicité institutionnelle. ([euipo.europa.eu](https://euipo.europa.eu/tunnel-web/secure/webdav/guest/document_library/contentPdfs/law_and_practice/decisions_president/EX-26-6_en.pdf))</w:t>
+        <w:t xml:space="preserve">Le compte rendu provisoire de la séance plénière du CSPLA du 15 décembre 2025, publié le 7 août 2026, rend compte d’échanges largement consacrés à l’intelligence artificielle générative. Ils interviennent dans un contexte de difficultés persistantes de rémunération des titulaires de droits au titre de l’entraînement des modèles et d’incertitudes portant tant sur le rattachement territorial des actes que sur le statut des contenus produits par ces systèmes. ([culture.gouv.fr](https://www.culture.gouv.fr/nous-connaitre/organisation-du-ministere/conseil-superieur-de-la-propriete-litteraire-et-artistique-cspla/travaux-et-publications-du-cspla/seances-plenieres-du-cspla/seances-plenieres-du-cspla-2025))</w:t>
+      </w:r>
+    </w:p>
+    <w:p>
+      <w:pPr>
+        <w:spacing w:after="180" w:line="300"/>
+        <w:jc w:val="both"/>
+      </w:pPr>
+      <w:r>
+        <w:t xml:space="preserve">Le CSPLA a examiné l’achèvement du cycle de concertation entre développeurs de modèles d’IA générative et ayants droit culturels, conduit après cinq réunions plénières et plus de quarante échanges bilatéraux. La concertation, menée à droit constant et sans instrument contraignant, n’a pas abouti à un partage de la valeur jugé pleinement satisfaisant. ([culture.gouv.fr](https://www.culture.gouv.fr/mc/content/download/393318/pdf_file/CSPLA%20-%20CR%20s%C3%A9ance%2015.12.2025%20%284%29.pdf?inLanguage=fre-FR&amp;version=1))</w:t>
+      </w:r>
+    </w:p>
+    <w:p>
+      <w:pPr>
+        <w:spacing w:after="180" w:line="300"/>
+        <w:jc w:val="both"/>
+      </w:pPr>
+      <w:r>
+        <w:t xml:space="preserve">Les échanges font ressortir l’opposition entre, d’une part, les ayants droit, qui soulignent les difficultés de preuve de l’utilisation des œuvres, les limites pratiques de l’opt-out et la rareté des négociations, et, d’autre part, les développeurs, invoquant notamment la possibilité de recourir à l’exception de fouille de textes et de données. Le compte rendu relève que les accords demeuraient principalement concentrés dans la presse et que les mécanismes techniques de réservation des droits apparaissaient inadaptés à plusieurs secteurs culturels. ([culture.gouv.fr](https://www.culture.gouv.fr/mc/content/download/393318/pdf_file/CSPLA%20-%20CR%20s%C3%A9ance%2015.12.2025%20%284%29.pdf?inLanguage=fre-FR&amp;version=1))</w:t>
+      </w:r>
+    </w:p>
+    <w:p>
+      <w:pPr>
+        <w:spacing w:after="180" w:line="300"/>
+        <w:jc w:val="both"/>
+      </w:pPr>
+      <w:r>
+        <w:t xml:space="preserve">Aucune question de droit n’est tranchée par le CSPLA dans ce compte rendu. Les travaux ont néanmoins porté, notamment, sur la détermination de la loi applicable aux reproductions effectuées lors de l’entraînement de modèles commercialisés dans l’Union européenne, ainsi que sur la protection et l’encadrement des contenus générés par IA.</w:t>
+      </w:r>
+    </w:p>
+    <w:p>
+      <w:pPr>
+        <w:spacing w:after="180" w:line="300"/>
+        <w:jc w:val="both"/>
+      </w:pPr>
+      <w:r>
+        <w:t xml:space="preserve">Le rapport présenté par Tristan Azzi et Yves El Hage retient que l’entraînement et l’exploitation du modèle forment une chaîne continue. Sur le fondement de la lex loci protectionis et de l’analyse du délit complexe, il privilégie la loi du ou des marchés où le modèle est commercialisé et utilisé, plutôt que celle du lieu techniquement incertain des reproductions. Le considérant 106 du règlement européen sur l’IA est regardé comme un élément interprétatif important, sans constituer une règle autonome de conflit de lois. ([culture.gouv.fr](https://www.culture.gouv.fr/mc/content/download/393318/pdf_file/CSPLA%20-%20CR%20s%C3%A9ance%2015.12.2025%20%284%29.pdf?inLanguage=fre-FR&amp;version=1))</w:t>
+      </w:r>
+    </w:p>
+    <w:p>
+      <w:pPr>
+        <w:spacing w:after="180" w:line="300"/>
+        <w:jc w:val="both"/>
+      </w:pPr>
+      <w:r>
+        <w:t xml:space="preserve">La séance n’a donné lieu à l’adoption d’aucune recommandation ni mesure normative définitive. Elle confirme la poursuite des missions relatives aux hypertrucages, au statut des contenus générés par IA et à l’attribution des œuvres et prestations artistiques. Les rapporteurs de la mission sur les hypertrucages précisent qu’aucune proposition définitive n’est encore arrêtée. ([culture.gouv.fr](https://www.culture.gouv.fr/mc/content/download/393318/pdf_file/CSPLA%20-%20CR%20s%C3%A9ance%2015.12.2025%20%284%29.pdf?inLanguage=fre-FR&amp;version=1))</w:t>
       </w:r>
     </w:p>
     <w:p>
@@ -267,7 +370,7 @@
         <w:t xml:space="preserve">Portée pratique. </w:t>
       </w:r>
       <w:r>
-        <w:t xml:space="preserve">Les titulaires et conseils doivent intégrer ces évolutions dans la gestion des portefeuilles de marques et de dessins ou modèles. En particulier, les revendications de priorité de dessins ou modèles peuvent désormais être documentées au moyen du mécanisme DAS lorsque les conditions prévues sont réunies. La consultation du registre électronique et le téléchargement d’extraits certifiés deviennent les voies ordinaires d’accès aux informations officielles. Les praticiens doivent également appliquer l’édition 2026 des directives, notamment pour les exigences de représentation des dessins ou modèles, les procédures de nullité et les formalités électroniques devant l’EUIPO. ([euipo.europa.eu](https://euipo.europa.eu/tunnel-web/secure/webdav/guest/document_library/contentPdfs/law_and_practice/decisions_president/EX-26-7_en.pdf))</w:t>
+        <w:t xml:space="preserve">Pour les titulaires de droits, le document confirme l’intérêt de documenter les réservations de droits, les démarches de négociation et les éléments susceptibles d’établir l’utilisation des contenus lors de l’entraînement. Pour les fournisseurs de modèles commercialisés dans l’Union, l’analyse exposée par la mission de droit international privé renforce le risque que les règles du marché visé soient mobilisées dans un litige. Les entreprises utilisant l’IA devront également suivre les travaux sur l’originalité des créations assistées, les contenus synthétiques, la contrefaçon, les droits de la personnalité, la responsabilité et les obligations de transparence. ([culture.gouv.fr](https://www.culture.gouv.fr/mc/content/download/393318/pdf_file/CSPLA%20-%20CR%20s%C3%A9ance%2015.12.2025%20%284%29.pdf?inLanguage=fre-FR&amp;version=1))</w:t>
       </w:r>
     </w:p>
     <w:p>
@@ -282,20 +385,20 @@
           <w:bCs/>
           <w:u w:val="single"/>
         </w:rPr>
-        <w:t xml:space="preserve">Les Bahamas adhèrent au Traité de coopération en matière de brevets</w:t>
+        <w:t xml:space="preserve">Contrat d’édition : adoption sénatoriale en première lecture d’une proposition de loi relative aux filières du livre et de l’œuvre musicale et à l’exception handicap</w:t>
       </w:r>
     </w:p>
     <w:p>
       <w:pPr>
         <w:spacing w:after="240"/>
       </w:pPr>
-      <w:hyperlink w:history="1" r:id="rIdlvh_l5fch9jzuiywobqoj">
+      <w:hyperlink w:history="1" r:id="rIdz383t0b6l4npxosex2uv2">
         <w:r>
           <w:rPr>
             <w:color w:val="507D82"/>
             <w:u w:val="single"/>
           </w:rPr>
-          <w:t xml:space="preserve">Notification PCT n° 227 — Adhésion du Commonwealth des Bahamas ; entrée en vigueur le 19 août 2026, 2026-05-19</w:t>
+          <w:t xml:space="preserve">Sénat, texte n° 132 (2025-2026), adopté en première lecture le 10 juin 2026, 10/06/2026</w:t>
         </w:r>
       </w:hyperlink>
     </w:p>
@@ -305,52 +408,52 @@
         <w:jc w:val="both"/>
       </w:pPr>
       <w:r>
-        <w:t xml:space="preserve">Le Directeur général de l’OMPI a notifié, le 19 mai 2026, le dépôt par le Gouvernement du Commonwealth des Bahamas de son instrument d’adhésion au Traité de coopération en matière de brevets, signé à Washington le 19 juin 1970 et ultérieurement amendé et modifié. L’entrée en vigueur du Traité à l’égard des Bahamas est intervenue le 19 août 2026. Cette adhésion porte à 159 le nombre des États membres de l’Union du PCT.</w:t>
-      </w:r>
-    </w:p>
-    <w:p>
-      <w:pPr>
-        <w:spacing w:after="180" w:line="300"/>
-        <w:jc w:val="both"/>
-      </w:pPr>
-      <w:r>
-        <w:t xml:space="preserve">L’actualité résulte d’un acte conventionnel international et non d’une procédure contentieuse. Les Bahamas ont déposé leur instrument d’adhésion auprès de l’OMPI le 19 mai 2026. La notification PCT n° 227 précise que cet instrument comportait une déclaration formulée sur le fondement de l’article 64(5) du PCT.</w:t>
-      </w:r>
-    </w:p>
-    <w:p>
-      <w:pPr>
-        <w:spacing w:after="180" w:line="300"/>
-        <w:jc w:val="both"/>
-      </w:pPr>
-      <w:r>
-        <w:t xml:space="preserve">Sans objet. La notification institutionnelle ne fait état ni de parties opposées ni d’arguments, l’adhésion procédant du dépôt d’un instrument par le Gouvernement du Commonwealth des Bahamas.</w:t>
-      </w:r>
-    </w:p>
-    <w:p>
-      <w:pPr>
-        <w:spacing w:after="180" w:line="300"/>
-        <w:jc w:val="both"/>
-      </w:pPr>
-      <w:r>
-        <w:t xml:space="preserve">Sans objet. Le document ne tranche aucune question de droit contentieuse ; il constate le dépôt de l’instrument d’adhésion et fixe les effets de cette adhésion dans l’ordre conventionnel du PCT.</w:t>
-      </w:r>
-    </w:p>
-    <w:p>
-      <w:pPr>
-        <w:spacing w:after="180" w:line="300"/>
-        <w:jc w:val="both"/>
-      </w:pPr>
-      <w:r>
-        <w:t xml:space="preserve">La notification de l’OMPI constate que les conditions formelles de l’adhésion ont été réalisées par le dépôt de l’instrument pertinent. Elle en déduit l’entrée en vigueur du PCT pour les Bahamas le 19 août 2026. Elle relève également la déclaration selon laquelle les Bahamas ne se considèrent pas liées par l’article 59 du PCT, conformément à l’article 64(5) de ce Traité.</w:t>
-      </w:r>
-    </w:p>
-    <w:p>
-      <w:pPr>
-        <w:spacing w:after="180" w:line="300"/>
-        <w:jc w:val="both"/>
-      </w:pPr>
-      <w:r>
-        <w:t xml:space="preserve">Depuis le 19 août 2026, les Bahamas constituent un État contractant du PCT. Les déposants nationaux ou résidents des Bahamas peuvent utiliser la procédure internationale du PCT pour solliciter une protection dans les États contractants désignés. Réciproquement, les déposants étrangers peuvent désigner les Bahamas dans une demande internationale afin d’y poursuivre la protection de leur invention à l’entrée en phase nationale. Le Guide du déposant PCT indique que l’Office international de l’OMPI est l’office récepteur compétent pour les déposants bahamiens et que l’office des Bahamas est l’office désigné ou élu compétent.</w:t>
+        <w:t xml:space="preserve">Le texte n° 132, adopté par le Sénat le 10 juin 2026 selon la procédure accélérée, transpose dans le code de la propriété intellectuelle plusieurs pratiques issues des filières du livre et de la musique. Il vise également à simplifier le régime de l’exception au droit d’auteur en faveur des personnes en situation de handicap. ([senat.fr](https://www.senat.fr/leg/tas25-132.html))</w:t>
+      </w:r>
+    </w:p>
+    <w:p>
+      <w:pPr>
+        <w:spacing w:after="180" w:line="300"/>
+        <w:jc w:val="both"/>
+      </w:pPr>
+      <w:r>
+        <w:t xml:space="preserve">La proposition de loi n° 522 rectifiée a été déposée au Sénat le 4 avril 2025. Après l’adoption du texte par le Sénat en première lecture le 10 juin 2026, celui-ci a été transmis à l’Assemblée nationale le 11 juin 2026. Le dossier sénatorial, mis à jour le 14 août 2026, ne fait apparaître à ce stade aucune étape ultérieure. ([senat.fr](https://www.senat.fr/dossier-legislatif/ppl24-522.html))</w:t>
+      </w:r>
+    </w:p>
+    <w:p>
+      <w:pPr>
+        <w:spacing w:after="180" w:line="300"/>
+        <w:jc w:val="both"/>
+      </w:pPr>
+      <w:r>
+        <w:t xml:space="preserve">Il ne s’agit pas d’un contentieux. Le texte soumis au Sénat et le texte adopté ont pour objet de donner une assise législative à des règles sectorielles relatives aux rapports entre auteurs et éditeurs, ainsi que d’aménager les modalités opérationnelles de l’exception handicap. Les arguments développés lors des débats ne sont pas analysés dans la présente fiche.</w:t>
+      </w:r>
+    </w:p>
+    <w:p>
+      <w:pPr>
+        <w:spacing w:after="180" w:line="300"/>
+        <w:jc w:val="both"/>
+      </w:pPr>
+      <w:r>
+        <w:t xml:space="preserve">La question traitée par le législateur est celle de l’intégration, au sein du code de la propriété intellectuelle, de garanties contractuelles applicables aux contrats d’édition de livres et aux contrats de cession et d’édition d’œuvres musicales, ainsi que de la sécurisation de la chaîne de mise à disposition des fichiers numériques nécessaires à la production de documents adaptés.</w:t>
+      </w:r>
+    </w:p>
+    <w:p>
+      <w:pPr>
+        <w:spacing w:after="180" w:line="300"/>
+        <w:jc w:val="both"/>
+      </w:pPr>
+      <w:r>
+        <w:t xml:space="preserve">Le texte adopté prévoit, pour l’édition de livres, un minimum de droits d’auteur garantis, une assiette de rémunération fondée sur les sommes brutes encaissées en cas de cession à un tiers, et l’exigence d’une annexe distincte pour le droit de préférence. Il instaure une reddition des comptes semestrielle, encadre l’information sur les sous-cessions et les traductions, organise la rémunération lors de l’écoulement des invendus et précise les obligations de l’éditeur à la cessation du contrat. ([senat.fr](https://www.senat.fr/leg/tas25-132.html)) Pour la musique, il prévoit notamment une reddition semestrielle, des mécanismes de résiliation de plein droit et la possibilité de rendre obligatoire un accord professionnel, à défaut duquel un décret en Conseil d’État fixerait les modalités d’application. ([senat.fr](https://www.senat.fr/leg/tas25-132.html))</w:t>
+      </w:r>
+    </w:p>
+    <w:p>
+      <w:pPr>
+        <w:spacing w:after="180" w:line="300"/>
+        <w:jc w:val="both"/>
+      </w:pPr>
+      <w:r>
+        <w:t xml:space="preserve">L’article 3 réécrit l’article L. 122-5-1 du code de la propriété intellectuelle. Il maintient une liste d’entités autorisées et prévoit un agrément pour l’accès, auprès de la Bibliothèque nationale de France, aux fichiers numériques déposés par les éditeurs. Le texte renforce les exigences de confidentialité, de sécurisation et de protection contre la dissémination liée à l’utilisation de l’intelligence artificielle ; il étend aussi les possibilités de saisine de l’Arcom. Certaines mesures applicables aux contrats en cours sont différées ou subordonnées à la détermination de leurs modalités d’application. ([senat.fr](https://www.senat.fr/leg/tas25-132.html))</w:t>
       </w:r>
     </w:p>
     <w:p>
@@ -370,7 +473,7 @@
         <w:t xml:space="preserve">Portée pratique. </w:t>
       </w:r>
       <w:r>
-        <w:t xml:space="preserve">Pour les titulaires de portefeuilles de brevets et les conseils, les Bahamas doivent désormais être intégrées aux stratégies de désignation PCT lorsque ce territoire présente un intérêt commercial ou défensif. L’adhésion ne confère toutefois pas un brevet unitaire ou automatique : la protection demeure subordonnée aux formalités et exigences applicables lors de l’entrée en phase nationale. À la date de mise à jour du Guide du déposant applicable au 19 août 2026, certaines informations nationales, notamment celles relatives aux exigences d’entrée en phase nationale, aux taxes et aux formulaires, ne sont pas encore disponibles. Une vérification du Guide du déposant PCT et des avis officiels de l’OMPI demeure donc nécessaire avant toute désignation ou décision d’entrée en phase nationale.</w:t>
+        <w:t xml:space="preserve">Si le texte était définitivement adopté, les éditeurs devraient réexaminer leurs modèles contractuels, leurs calendriers de reddition, leurs procédures de sous-cession, de gestion des invendus et de fin d’exploitation. Les acteurs de l’édition musicale devraient également anticiper les obligations de transparence et de résiliation. Les éditeurs et entités autorisées intervenant dans l’exception handicap devraient adapter leurs processus de dépôt, d’accès, de conservation et de sécurisation des fichiers numériques.</w:t>
       </w:r>
     </w:p>
     <w:p>
@@ -385,20 +488,20 @@
           <w:bCs/>
           <w:u w:val="single"/>
         </w:rPr>
-        <w:t xml:space="preserve">Séisme en Colombie : l’OEB précise les recours en cas de non-respect des délais</w:t>
+        <w:t xml:space="preserve">Renforcement des mécanismes administratifs, civils et pénaux de lutte contre le piratage des contenus sportifs</w:t>
       </w:r>
     </w:p>
     <w:p>
       <w:pPr>
         <w:spacing w:after="240"/>
       </w:pPr>
-      <w:hyperlink w:history="1" r:id="rIdyek2n9wg8um_qhq5nxq48">
+      <w:hyperlink w:history="1" r:id="rId4pmd4q7zpfhxykiy7x-jz">
         <w:r>
           <w:rPr>
             <w:color w:val="507D82"/>
             <w:u w:val="single"/>
           </w:rPr>
-          <w:t xml:space="preserve">JO OEB 2026, A39 — Notice de l’Office européen des brevets du 19 août 2026 concernant l’application de la règle 134(5) CBE après le séisme survenu en Colombie le 10 août 2026, 2026-08-31</w:t>
+          <w:t xml:space="preserve">Loi n° 2026-725 du 3 août 2026, art. 31 à 34, 04/08/2026</w:t>
         </w:r>
       </w:hyperlink>
     </w:p>
@@ -408,52 +511,52 @@
         <w:jc w:val="both"/>
       </w:pPr>
       <w:r>
-        <w:t xml:space="preserve">À la suite du séisme intervenu en Colombie le 10 août 2026, l’Office européen des brevets a publié une notice rappelant les voies de recours ouvertes lorsque cet événement exceptionnel a empêché le respect d’un délai vis-à-vis de l’OEB. La notice, datée du 19 août 2026 et publiée en ligne le 31 août 2026, couvre les procédures relevant de la CBE, de la réglementation relative à la protection unitaire et du PCT.</w:t>
-      </w:r>
-    </w:p>
-    <w:p>
-      <w:pPr>
-        <w:spacing w:after="180" w:line="300"/>
-        <w:jc w:val="both"/>
-      </w:pPr>
-      <w:r>
-        <w:t xml:space="preserve">La notice ne constate pas une prorogation générale des délais. Elle attire l’attention des demandeurs, parties aux procédures et mandataires affectés sur les mécanismes de sauvegarde existants. Pour les procédures CBE, l’OEB vise la règle 134(5) CBE, applicable lorsqu’un retard résulte d’une perturbation dans l’acheminement ou la transmission du courrier causée par un événement exceptionnel affectant le lieu de résidence ou le siège de l’intéressé.</w:t>
-      </w:r>
-    </w:p>
-    <w:p>
-      <w:pPr>
-        <w:spacing w:after="180" w:line="300"/>
-        <w:jc w:val="both"/>
-      </w:pPr>
-      <w:r>
-        <w:t xml:space="preserve">Aucun litige, aucune partie et aucun argument contradictoire ne sont précisés, la publication constituant une information institutionnelle de portée générale.</w:t>
-      </w:r>
-    </w:p>
-    <w:p>
-      <w:pPr>
-        <w:spacing w:after="180" w:line="300"/>
-        <w:jc w:val="both"/>
-      </w:pPr>
-      <w:r>
-        <w:t xml:space="preserve">La notice précise les conditions dans lesquelles un retard directement lié au séisme peut être neutralisé dans les procédures devant l’OEB.</w:t>
-      </w:r>
-    </w:p>
-    <w:p>
-      <w:pPr>
-        <w:spacing w:after="180" w:line="300"/>
-        <w:jc w:val="both"/>
-      </w:pPr>
-      <w:r>
-        <w:t xml:space="preserve">Au titre de la règle 134(5) CBE, un document reçu tardivement est réputé reçu dans le délai si l’intéressé établit qu’il n’a pas été possible de respecter celui-ci, à un jour quelconque des dix jours précédant son expiration, en raison de l’événement exceptionnel. Il doit également démontrer que l’envoi ou la transmission a été effectué au plus tard le cinquième jour suivant la fin de la perturbation. Ces conditions supposent donc une appréciation individualisée et la production d’éléments de preuve.</w:t>
-      </w:r>
-    </w:p>
-    <w:p>
-      <w:pPr>
-        <w:spacing w:after="180" w:line="300"/>
-        <w:jc w:val="both"/>
-      </w:pPr>
-      <w:r>
-        <w:t xml:space="preserve">L’OEB confirme que la règle 134(5) CBE peut être invoquée par les demandeurs, parties et mandataires affectés en Colombie. Cette règle s’applique mutatis mutandis aux procédures relatives aux brevets européens à effet unitaire, conformément à la règle 20(2)(g) du règlement d’application relatif à la protection unitaire.</w:t>
+        <w:t xml:space="preserve">Publiée au Journal officiel du 4 août 2026, la loi n° 2026-725 consacre son chapitre III au renforcement de la lutte contre le piratage des contenus sportifs. Les articles 31 à 34 modifient principalement le code du sport et le code de la propriété intellectuelle afin d’accroître l’effectivité des mesures de blocage pendant les retransmissions en direct, d’élargir le champ des bénéficiaires du dispositif et de compléter l’arsenal répressif. ([legifrance.gouv.fr](https://www.legifrance.gouv.fr/jorf/id/JORFSCTA000054608061))</w:t>
+      </w:r>
+    </w:p>
+    <w:p>
+      <w:pPr>
+        <w:spacing w:after="180" w:line="300"/>
+        <w:jc w:val="both"/>
+      </w:pPr>
+      <w:r>
+        <w:t xml:space="preserve">Sans objet. La présente fiche porte sur une évolution législative et non sur une décision juridictionnelle. Le texte a été promulgué le 3 août 2026 et publié au Journal officiel du 4 août 2026. ([legifrance.gouv.fr](https://www.legifrance.gouv.fr/jorf/id/JORFSCTA000054608061))</w:t>
+      </w:r>
+    </w:p>
+    <w:p>
+      <w:pPr>
+        <w:spacing w:after="180" w:line="300"/>
+        <w:jc w:val="both"/>
+      </w:pPr>
+      <w:r>
+        <w:t xml:space="preserve">Sans objet. Les articles examinés ne tranchent pas un litige et ne reproduisent pas d’arguments de parties.</w:t>
+      </w:r>
+    </w:p>
+    <w:p>
+      <w:pPr>
+        <w:spacing w:after="180" w:line="300"/>
+        <w:jc w:val="both"/>
+      </w:pPr>
+      <w:r>
+        <w:t xml:space="preserve">Sans objet. La loi traite, sur le plan normatif, des modalités de prévention, de cessation et de répression des atteintes aux droits d’exploitation audiovisuelle de compétitions et manifestations sportives.</w:t>
+      </w:r>
+    </w:p>
+    <w:p>
+      <w:pPr>
+        <w:spacing w:after="180" w:line="300"/>
+        <w:jc w:val="both"/>
+      </w:pPr>
+      <w:r>
+        <w:t xml:space="preserve">L’article 31 étend le champ de l’article L. 333-10 du code du sport aux sociétés commerciales créées pour l’exploitation des droits audiovisuels et aux personnes morales, françaises ou étrangères, organisant une compétition ou commercialisant ou exploitant ces droits. Il instaure un mécanisme de blocage dynamique : lorsqu’une ordonnance le prévoit, les titulaires de droits transmettent à l’Arcom, via un système automatisé placé sous son contrôle, les données d’identification de services non identifiés lors du prononcé de l’ordonnance. Les personnes visées par celle-ci doivent exécuter sans délai les mesures ordonnées durant la retransmission en direct. Le dispositif est assorti d’obligations de preuve, d’actualisation des données et de demande de levée du blocage lorsque celles-ci ne sont plus actives ou ont changé d’objet. L’Arcom contrôle les modalités de collecte, peut suspendre une mesure non conforme, formuler des préconisations puis enjoindre au titulaire de droits d’interrompre ses transmissions. Un recours administratif est ouvert au service concerné et les litiges entre titulaires de droits et personnes assujetties à l’ordonnance relèvent du président du tribunal judiciaire. ([legifrance.gouv.fr](https://www.legifrance.gouv.fr/jorf/id/JORFSCTA000054608061))</w:t>
+      </w:r>
+    </w:p>
+    <w:p>
+      <w:pPr>
+        <w:spacing w:after="180" w:line="300"/>
+        <w:jc w:val="both"/>
+      </w:pPr>
+      <w:r>
+        <w:t xml:space="preserve">La loi crée également les articles L. 333-13 à L. 333-15 du code du sport. Sont notamment incriminés la mise à disposition d’un service diffusant illicitement une compétition, la communication habituelle de retransmissions non autorisées par une plateforme, ainsi que certains dispositifs ou logiciels destinés à permettre l’accès illégal aux services concernés. Les peines de principe sont de trois ans d’emprisonnement et 300 000 euros d’amende, portées à sept ans et 750 000 euros en bande organisée. L’incitation à l’usage de tels services, dispositifs ou logiciels est également réprimée. Les articles 32 et 33 étendent aux droits sportifs concernés le champ de certaines dispositions du code de la propriété intellectuelle relatives à l’action de l’Arcom. ([legifrance.gouv.fr](https://www.legifrance.gouv.fr/jorf/id/JORFSCTA000054608061))</w:t>
       </w:r>
     </w:p>
     <w:p>
@@ -473,7 +576,7 @@
         <w:t xml:space="preserve">Portée pratique. </w:t>
       </w:r>
       <w:r>
-        <w:t xml:space="preserve">Les titulaires de portefeuilles et leurs conseils doivent identifier sans délai les échéances concernées, conserver les preuves de l’empêchement et documenter la date de cessation de la perturbation ainsi que celle de la transmission. En phase internationale, la règle 82quater.1 PCT régit les délais et conditions applicables. Elle ne couvre pas le délai de revendication de priorité ; l’OEB rappelle toutefois que la restauration du droit de priorité au titre de la règle 26bis.3 PCT peut, le cas échéant, être envisagée.</w:t>
+        <w:t xml:space="preserve">Les titulaires de droits, diffuseurs exclusifs, ligues et sociétés commerciales concernées devront sécuriser leurs procédures de détection, de qualification et de conservation des preuves, ainsi que leurs circuits de transmission à l’Arcom. Les intermédiaires désignés par une ordonnance de blocage s’exposent désormais à une sanction administrative pouvant atteindre 75 000 euros ou 1 % du chiffre d’affaires mondial hors taxes, seuil doublé en cas de réitération. Les accords volontaires encouragés par l’Arcom devront en outre répartir le coût des mesures et prévoir leur évaluation périodique. Les dispositions des articles L. 333-10 à L. 333-15 sont rendues applicables en Nouvelle-Calédonie, en Polynésie française et dans les îles Wallis-et-Futuna. ([legifrance.gouv.fr](https://www.legifrance.gouv.fr/jorf/id/JORFSCTA000054608061))</w:t>
       </w:r>
     </w:p>
     <w:p>
@@ -488,20 +591,20 @@
           <w:bCs/>
           <w:u w:val="single"/>
         </w:rPr>
-        <w:t xml:space="preserve">Le CSPLA poursuit ses travaux sur la loi applicable à l’entraînement des modèles d’IA générative et sur les œuvres générées par IA</w:t>
+        <w:t xml:space="preserve">Décision n° EX-26-07 du directeur exécutif de l’EUIPO concernant les registres des marques et dessins ou modèles de l’Union européenne, les bases de données des procédures et de la jurisprudence</w:t>
       </w:r>
     </w:p>
     <w:p>
       <w:pPr>
         <w:spacing w:after="240"/>
       </w:pPr>
-      <w:hyperlink w:history="1" r:id="rIdqmubnznqwey87vgupdrs8">
+      <w:hyperlink w:history="1" r:id="rIdfzwoyjeawnbth9q1ty7--">
         <w:r>
           <w:rPr>
             <w:color w:val="507D82"/>
             <w:u w:val="single"/>
           </w:rPr>
-          <w:t xml:space="preserve">Compte rendu provisoire de la séance plénière du CSPLA du 15 décembre 2025, 2026-08-07</w:t>
+          <w:t xml:space="preserve">EUIPO, décision n° EX-26-07 du directeur exécutif, 8 juin 2026, 2026-06-08</w:t>
         </w:r>
       </w:hyperlink>
     </w:p>
@@ -511,52 +614,52 @@
         <w:jc w:val="both"/>
       </w:pPr>
       <w:r>
-        <w:t xml:space="preserve">Publié le 7 août 2026, le compte rendu, expressément qualifié de version provisoire, restitue les échanges intervenus lors de la séance plénière du CSPLA du 15 décembre 2025. La séance a notamment porté sur la détermination de la loi applicable aux reproductions réalisées pour l’entraînement de modèles d’IA générative commercialisés dans l’Union européenne, ainsi que sur l’état d’avancement de missions relatives aux contenus générés avec l’IA et à l’attribution des œuvres et prestations artistiques. ([culture.gouv.fr](https://www.culture.gouv.fr/nous-connaitre/organisation-du-ministere/conseil-superieur-de-la-propriete-litteraire-et-artistique-cspla/travaux-et-publications-du-cspla/seances-plenieres-du-cspla/seances-plenieres-du-cspla-2025))</w:t>
-      </w:r>
-    </w:p>
-    <w:p>
-      <w:pPr>
-        <w:spacing w:after="180" w:line="300"/>
-        <w:jc w:val="both"/>
-      </w:pPr>
-      <w:r>
-        <w:t xml:space="preserve">Les travaux de Tristan Azzi et Yves El Hage portent sur plusieurs volets de droit international privé, comprenant la compétence juridictionnelle, la loi applicable aux contenus générés par IA et à leur exploitation, mais la présentation du 15 décembre 2025 est concentrée sur les reproductions d’œuvres et d’objets protégés réalisées aux fins d’entraînement des modèles. Alexandra Bensamoun et Julie Groffe-Charrier conduisent, depuis l’été 2025, une mission sur le statut des contenus générés avec l’IA. Une mission distincte, engagée en juin 2025 et confiée à Valérie-Laure Benabou et Séverine Dusollier, examine les mécanismes d’attribution des œuvres, contenus et prestations. ([culture.gouv.fr](https://www.culture.gouv.fr/mc/content/download/393318/pdf_file/CSPLA%20-%20CR%20s%C3%A9ance%2015.12.2025%20%284%29.pdf?inLanguage=fre-FR&amp;version=1))</w:t>
-      </w:r>
-    </w:p>
-    <w:p>
-      <w:pPr>
-        <w:spacing w:after="180" w:line="300"/>
-        <w:jc w:val="both"/>
-      </w:pPr>
-      <w:r>
-        <w:t xml:space="preserve">Le compte rendu rapporte, d’une part, la thèse de certains opérateurs selon laquelle les actes de reproduction nécessaires à l’entraînement seraient autonomes et devraient relever de la loi du lieu matériel de leur accomplissement. D’autre part, les auteurs du rapport relèvent les difficultés pratiques considérables d’identification de ce lieu, compte tenu de la distribution des opérations entre infrastructures et territoires. Dans les travaux sur les contenus générés, les contributions recueillies, dont certaines sont confidentielles, font apparaître la nécessité de distinguer les créations assistées par IA, celles générées avec son concours et les contenus entièrement générés, provisoirement qualifiés de contenus synthétiques. ([culture.gouv.fr](https://www.culture.gouv.fr/mc/content/download/393318/pdf_file/CSPLA%20-%20CR%20s%C3%A9ance%2015.12.2025%20%284%29.pdf?inLanguage=fre-FR&amp;version=1))</w:t>
-      </w:r>
-    </w:p>
-    <w:p>
-      <w:pPr>
-        <w:spacing w:after="180" w:line="300"/>
-        <w:jc w:val="both"/>
-      </w:pPr>
-      <w:r>
-        <w:t xml:space="preserve">La question étudiée consiste à déterminer, au regard des règles de droit international privé, quelle loi régit les reproductions d’œuvres ou d’objets protégés effectuées pour entraîner un modèle d’IA générative lorsque ce modèle est commercialisé et utilisé dans un ou plusieurs États de l’Union européenne. Les missions en cours soulèvent parallèlement la question des conditions dans lesquelles l’intervention d’un outil d’IA affecte l’accès d’une création au droit d’auteur et celle de la fiabilité des mécanismes permettant d’identifier les contributeurs humains.</w:t>
-      </w:r>
-    </w:p>
-    <w:p>
-      <w:pPr>
-        <w:spacing w:after="180" w:line="300"/>
-        <w:jc w:val="both"/>
-      </w:pPr>
-      <w:r>
-        <w:t xml:space="preserve">Le rapport présenté au CSPLA retient comme point de départ la lex loci protectionis, visée notamment par l’article 5, paragraphe 2, de la Convention de Berne et l’article 8, paragraphe 1, du règlement Rome II. Il assimile la relation entre l’entraînement et l’exploitation du modèle à un délit complexe : l’input constitue le fait générateur, tandis que l’output correspond à la réalisation du dommage. Il en déduit que la loi applicable à l’entraînement est celle du ou des marchés effectivement ciblés, où le modèle est commercialisé et utilisé. L’article 53 et le considérant 106 du règlement européen sur l’IA conforteraient cette lecture, sans constituer à eux seuls une règle de conflit autonome. À titre subsidiaire, le rapport évoque l’éventuelle mobilisation des lois de police et de l’ordre public international. ([culture.gouv.fr](https://www.culture.gouv.fr/mc/content/download/393318/pdf_file/CSPLA%20-%20CR%20s%C3%A9ance%2015.12.2025%20%284%29.pdf?inLanguage=fre-FR&amp;version=1))</w:t>
-      </w:r>
-    </w:p>
-    <w:p>
-      <w:pPr>
-        <w:spacing w:after="180" w:line="300"/>
-        <w:jc w:val="both"/>
-      </w:pPr>
-      <w:r>
-        <w:t xml:space="preserve">Il ne s’agit ni d’une décision juridictionnelle ni de recommandations définitives du CSPLA. Le rapport de mission privilégie néanmoins l’application de la loi du pays de commercialisation et d’utilisation du modèle aux opérations d’entraînement, plutôt que celle du lieu technique de reproduction. Concernant les contenus générés avec l’IA, les travaux restent au stade de l’analyse des contributions, des auditions et de la qualification des productions. S’agissant de l’attribution, la mission demeure exploratoire et n’a pas arrêté de structure définitive de rapport. ([culture.gouv.fr](https://www.culture.gouv.fr/mc/content/download/393318/pdf_file/CSPLA%20-%20CR%20s%C3%A9ance%2015.12.2025%20%284%29.pdf?inLanguage=fre-FR&amp;version=1))</w:t>
+        <w:t xml:space="preserve">Adoptée le 8 juin 2026, la décision n° EX-26-07 précise les modalités de tenue, de consultation et d’exploitation des principales sources d’information de l’EUIPO relatives aux marques de l’Union européenne et aux dessins ou modèles de l’Union européenne. Elle s’inscrit dans le cadre du règlement (UE) 2017/1001 sur la marque de l’Union européenne et du règlement (UE) 2026/715 sur les dessins ou modèles de l’Union européenne. Le texte vise la transparence, la prévisibilité et la cohérence des systèmes de titres unitaires administrés par l’Office.</w:t>
+      </w:r>
+    </w:p>
+    <w:p>
+      <w:pPr>
+        <w:spacing w:after="180" w:line="300"/>
+        <w:jc w:val="both"/>
+      </w:pPr>
+      <w:r>
+        <w:t xml:space="preserve">Il ne s’agit pas d’une décision contentieuse. Le directeur exécutif exerce son pouvoir d’organisation des registres et bases de données afin, notamment, d’intégrer les références et la terminologie résultant du nouveau règlement sur les dessins ou modèles de l’Union européenne. La décision EX-25-5 du 7 avril 2025 et ses annexes I et II sont expressément abrogées.</w:t>
+      </w:r>
+    </w:p>
+    <w:p>
+      <w:pPr>
+        <w:spacing w:after="180" w:line="300"/>
+        <w:jc w:val="both"/>
+      </w:pPr>
+      <w:r>
+        <w:t xml:space="preserve">Aucune partie ni argumentation contradictoire ne sont en cause. La décision repose sur les considérants du directeur exécutif relatifs à l’accès des utilisateurs aux informations pertinentes sur les titres, aux fonctions distinctes des registres et des bases de données, ainsi qu’à la nécessité de protéger les intérêts des tiers consultant les registres.</w:t>
+      </w:r>
+    </w:p>
+    <w:p>
+      <w:pPr>
+        <w:spacing w:after="180" w:line="300"/>
+        <w:jc w:val="both"/>
+      </w:pPr>
+      <w:r>
+        <w:t xml:space="preserve">La décision détermine les données devant figurer dans les registres électroniques de l’EUIPO, les conditions de leur accessibilité, les modalités de délivrance des extraits, le périmètre de la base de données des procédures et les règles de publication de la jurisprudence, y compris au regard des données à caractère personnel.</w:t>
+      </w:r>
+    </w:p>
+    <w:p>
+      <w:pPr>
+        <w:spacing w:after="180" w:line="300"/>
+        <w:jc w:val="both"/>
+      </w:pPr>
+      <w:r>
+        <w:t xml:space="preserve">Le texte distingue les registres, qui constituent le relevé officiel des inscriptions relatives à un titre déterminé, de la base de données des particularités des titres et procédures, ces instruments remplissant des fonctions différentes et contenant des ensembles de données distincts. Les inscriptions sont centralisées dans l’eRegister, avec une interface publique permettant une présentation chronologique à vocation historique. Pour les marques, les inscriptions deviennent accessibles lorsque la demande est réputée déposée ; pour les dessins ou modèles, elles le deviennent lors de l’enregistrement. Les informations détaillées affichées dans l’eRegister ne sont toutefois complètes que pour les données enregistrées à compter du 31 mars 2021 ; l’inspection en ligne des dossiers demeure disponible gratuitement pour obtenir des précisions, notamment sur les inscriptions antérieures. La décision prévoit également des inscriptions protectrices résultant de mesures judiciaires, administratives ou européennes susceptibles de geler le titre et d’empêcher certaines opérations, telles qu’un transfert.</w:t>
+      </w:r>
+    </w:p>
+    <w:p>
+      <w:pPr>
+        <w:spacing w:after="180" w:line="300"/>
+        <w:jc w:val="both"/>
+      </w:pPr>
+      <w:r>
+        <w:t xml:space="preserve">L’eRegister est accessible via eSearch plus, sauf pour les dessins ou modèles faisant l’objet d’un ajournement de publication, dont les données ne deviennent pleinement publiques qu’à l’expiration de cet ajournement. Les extraits téléchargés depuis l’eRegister sont, par défaut, certifiés et assortis d’un code permettant d’en vérifier l’authenticité en ligne. La base de données intégrée à eSearch plus est gratuite et téléchargeable ; son accès massif peut être soumis à un accord avec l’Office. Les données personnelles complémentaires, telles que les coordonnées des parties et représentants, ne sont rendues publiques qu’avec le consentement exprès de la personne concernée.</w:t>
       </w:r>
     </w:p>
     <w:p>
@@ -576,110 +679,7 @@
         <w:t xml:space="preserve">Portée pratique. </w:t>
       </w:r>
       <w:r>
-        <w:t xml:space="preserve">Pour les fournisseurs de modèles visant le marché français ou d’autres marchés de l’Union, cette analyse renforce le risque que les opérations d’entraînement soient appréciées au regard de la loi des territoires ciblés, même lorsque l’infrastructure technique est située hors de l’Union. Pour les titulaires de droits, elle offre un cadre argumentatif en faveur de l’effectivité territoriale des règles européennes de droit d’auteur. Les entreprises utilisant l’IA dans leurs processus créatifs devront également suivre les travaux relatifs à l’originalité, à la contrefaçon en aval, aux droits de la personnalité et à la traçabilité des contributions au moyen de métadonnées et de crédits. ([culture.gouv.fr](https://www.culture.gouv.fr/mc/content/download/393318/pdf_file/CSPLA%20-%20CR%20s%C3%A9ance%2015.12.2025%20%284%29.pdf?inLanguage=fre-FR&amp;version=1))</w:t>
-      </w:r>
-    </w:p>
-    <w:p>
-      <w:pPr>
-        <w:pStyle w:val="Heading2"/>
-        <w:keepNext/>
-        <w:spacing w:after="100" w:before="180"/>
-      </w:pPr>
-      <w:r>
-        <w:rPr>
-          <w:b/>
-          <w:bCs/>
-          <w:u w:val="single"/>
-        </w:rPr>
-        <w:t xml:space="preserve">Réforme européenne des dessins et modèles : fichiers 3D, animations et interfaces numériques</w:t>
-      </w:r>
-    </w:p>
-    <w:p>
-      <w:pPr>
-        <w:spacing w:after="240"/>
-      </w:pPr>
-      <w:hyperlink w:history="1" r:id="rIdhpetoaqajcvezg66y1d5i">
-        <w:r>
-          <w:rPr>
-            <w:color w:val="507D82"/>
-            <w:u w:val="single"/>
-          </w:rPr>
-          <w:t xml:space="preserve">Décision nº EX-26-03 du directeur exécutif de l’EUIPO du 8 juin 2026, relative à la communication par voie électronique, entrée en vigueur le 1er juillet 2026., 2026-08-03</w:t>
-        </w:r>
-      </w:hyperlink>
-    </w:p>
-    <w:p>
-      <w:pPr>
-        <w:spacing w:after="180" w:line="300"/>
-        <w:jc w:val="both"/>
-      </w:pPr>
-      <w:r>
-        <w:t xml:space="preserve">La réforme du cadre européen des dessins et modèles, pleinement applicable à l’EUIPO depuis le 1er juillet 2026, adapte les modalités de représentation aux créations numériques. Elle accompagne l’extension du champ des dessins et modèles aux caractéristiques animées, mobiles ou transitionnelles et à des produits non matériels, parmi lesquels figurent notamment les interfaces graphiques. La décision nº EX-26-03 fixe les conditions techniques de dépôt électronique applicables aux dessins ou modèles de l’Union européenne.</w:t>
-      </w:r>
-    </w:p>
-    <w:p>
-      <w:pPr>
-        <w:spacing w:after="180" w:line="300"/>
-        <w:jc w:val="both"/>
-      </w:pPr>
-      <w:r>
-        <w:t xml:space="preserve">Il ne s’agit pas d’un contentieux. La décision du directeur exécutif de l’EUIPO est adoptée sur le fondement, notamment, de l’article 42, paragraphe 5, du règlement sur les dessins et modèles de l’Union européenne. Elle organise la communication électronique avec l’Office et précise les formats, tailles et caractéristiques techniques des fichiers déposés comme représentation d’un dessin ou modèle.</w:t>
-      </w:r>
-    </w:p>
-    <w:p>
-      <w:pPr>
-        <w:spacing w:after="180" w:line="300"/>
-        <w:jc w:val="both"/>
-      </w:pPr>
-      <w:r>
-        <w:t xml:space="preserve">Sans objet, la mesure étant de nature réglementaire et administrative.</w:t>
-      </w:r>
-    </w:p>
-    <w:p>
-      <w:pPr>
-        <w:spacing w:after="180" w:line="300"/>
-        <w:jc w:val="both"/>
-      </w:pPr>
-      <w:r>
-        <w:t xml:space="preserve">La question traitée est celle des conditions dans lesquelles un déposant peut représenter électroniquement un dessin ou modèle de l’Union au moyen de vues statiques, d’un fichier tridimensionnel dynamique ou d’une animation, sans compromettre l’identification claire de l’objet de la protection demandée.</w:t>
-      </w:r>
-    </w:p>
-    <w:p>
-      <w:pPr>
-        <w:spacing w:after="180" w:line="300"/>
-        <w:jc w:val="both"/>
-      </w:pPr>
-      <w:r>
-        <w:t xml:space="preserve">La décision prend acte de la possibilité désormais ouverte de déposer des moyens de représentation non statiques. Elle relève que cette faculté, combinée à l’augmentation du nombre de dessins susceptibles d’être réunis dans une demande multiple, est susceptible d’accroître les contraintes de sécurité et de fonctionnement des systèmes de l’Office. Elle justifie ainsi la fixation de limitations techniques portant sur le nombre de vues et la taille des fichiers. La représentation demeure déterminante pour délimiter l’objet protégé : le déposant ne peut combiner plusieurs types de représentation pour un même dessin. Les exigences formelles distinctes de la condition d’une représentation suffisamment claire continuent, quant à elles, de pouvoir conduire au refus de la demande si elles ne sont pas régularisées.</w:t>
-      </w:r>
-    </w:p>
-    <w:p>
-      <w:pPr>
-        <w:spacing w:after="180" w:line="300"/>
-        <w:jc w:val="both"/>
-      </w:pPr>
-      <w:r>
-        <w:t xml:space="preserve">Pour une représentation statique, l’EUIPO accepte jusqu’à dix fichiers JPEG par dessin, dans la limite de 2 Mo par fichier et de 20 Mo au total. Pour une représentation dynamique, un seul fichier OBJ ou STL peut être déposé par dessin ; pour une représentation animée, un seul fichier MP4 est admis. Les fichiers dynamiques et animés sont limités à 20 Mo. Le MP4 doit notamment être encodé en H.264, présenter une cadence comprise entre 24 et 30 images par seconde, une résolution minimale de 1 280 × 720 pixels et ne comporter aucune piste audio.</w:t>
-      </w:r>
-    </w:p>
-    <w:p>
-      <w:pPr>
-        <w:pBdr>
-          <w:left w:val="single" w:color="507D82" w:sz="10" w:space="8"/>
-        </w:pBdr>
-        <w:spacing w:after="260" w:before="80"/>
-        <w:ind w:left="180"/>
-        <w:jc w:val="both"/>
-      </w:pPr>
-      <w:r>
-        <w:rPr>
-          <w:b/>
-          <w:bCs/>
-        </w:rPr>
-        <w:t xml:space="preserve">Portée pratique. </w:t>
-      </w:r>
-      <w:r>
-        <w:t xml:space="preserve">Les titulaires d’interfaces graphiques, d’objets numériques, d’animations ou de produits dont l’apparence comporte une transition visuelle disposent désormais d’un véhicule de représentation plus adapté que la seule juxtaposition de vues fixes. Le choix du format doit néanmoins être arrêté avant le dépôt : un même dessin ne peut être représenté à la fois par des vues JPEG et par une vidéo ou un modèle 3D. Les équipes de création et les conseils doivent également vérifier en amont la cohérence de la représentation, l’absence d’éléments non revendiqués non clairement exclus et la conformité des fichiers aux seuils techniques de l’EUIPO. Une attention particulière demeure nécessaire en cas de stratégie internationale, la reconnaissance d’une priorité fondée sur une représentation dynamique ou animée n’étant pas nécessairement assurée hors de l’Union européenne.</w:t>
+        <w:t xml:space="preserve">La décision entre en vigueur le 1er juillet 2026. Les praticiens disposent ainsi d’un cadre explicite pour vérifier l’état et l’historique d’un titre, obtenir gratuitement un extrait certifié en ligne et identifier d’éventuelles inscriptions protectrices affectant sa disponibilité ou sa transmissibilité. Les utilisateurs recourant à des extractions massives devront distinguer les jeux de données ouverts, qui excluent les données personnelles visées par la décision, des accès contractuels proposés par l’Office. Les annexes I et II déterminent les informations visibles dans les inscriptions respectivement relatives aux marques et aux dessins ou modèles.</w:t>
       </w:r>
     </w:p>
     <w:p>
@@ -694,7 +694,7 @@
           <w:sz w:val="18"/>
           <w:szCs w:val="18"/>
         </w:rPr>
-        <w:t xml:space="preserve">Sélection de six sujets issus des neuf sources contrôlées, en privilégiant les sources institutionnelles et primaires, les publications récentes et un équilibre entre marques, brevets, dessins et modèles, droit d’auteur et intelligence artificielle. Les analyses de Dreyfus &amp; Associés sont retenues uniquement lorsqu’aucune publication primaire suffisamment vérifiable n’a été identifiée sur le sujet.</w:t>
+        <w:t xml:space="preserve">Sélection fondée sur les URL primaires vérifiables des sources contrôlées. La veille privilégie les textes et décisions directement exploitables, avec un équilibre entre marques, dessins et modèles, brevets, droit d’auteur, IA et numérique. Les résultats CJUE et les alertes Google insuffisamment documentés n’ont pas été retenus.</w:t>
       </w:r>
     </w:p>
     <w:sectPr>

</xml_diff>